<commit_message>
Add settings panel: dark/light theme + ID/EN language toggle
</commit_message>
<xml_diff>
--- a/docs/dokumentasi_bi.docx
+++ b/docs/dokumentasi_bi.docx
@@ -54,15 +54,7 @@
         </w:rPr>
       </w:pPr>
       <w:r>
-        <w:t xml:space="preserve">Dengan </w:t>
-      </w:r>
-      <w:proofErr w:type="gramStart"/>
-      <w:r>
-        <w:t>judul :</w:t>
-      </w:r>
-      <w:proofErr w:type="gramEnd"/>
-      <w:r>
-        <w:t xml:space="preserve"> </w:t>
+        <w:t xml:space="preserve">Dengan judul : </w:t>
       </w:r>
       <w:r>
         <w:rPr>
@@ -136,13 +128,8 @@
     </w:p>
     <w:p>
       <w:r>
-        <w:t xml:space="preserve">Contoh 10 bari pertama </w:t>
-      </w:r>
-      <w:proofErr w:type="gramStart"/>
-      <w:r>
-        <w:t>dalam  data</w:t>
-      </w:r>
-      <w:proofErr w:type="gramEnd"/>
+        <w:t>Contoh 10 bari pertama dalam  data</w:t>
+      </w:r>
     </w:p>
     <w:p>
       <w:r>
@@ -188,15 +175,7 @@
     </w:p>
     <w:p>
       <w:r>
-        <w:t xml:space="preserve">Kolom pertama (symbol) menjelaskan nama perusahaan atau kode perusahaan di bei </w:t>
-      </w:r>
-      <w:proofErr w:type="gramStart"/>
-      <w:r>
-        <w:t>cth :</w:t>
-      </w:r>
-      <w:proofErr w:type="gramEnd"/>
-      <w:r>
-        <w:t xml:space="preserve"> AALI = </w:t>
+        <w:t xml:space="preserve">Kolom pertama (symbol) menjelaskan nama perusahaan atau kode perusahaan di bei cth : AALI = </w:t>
       </w:r>
       <w:r>
         <w:t>Astra Agro Lestari</w:t>
@@ -285,21 +264,8 @@
     <w:p>
       <w:r>
         <w:lastRenderedPageBreak/>
-        <w:t xml:space="preserve">Kolom kedua berisikan account atau biasa dikenal juga dengan indikator </w:t>
-      </w:r>
-      <w:proofErr w:type="gramStart"/>
-      <w:r>
-        <w:t>keuangan ,</w:t>
-      </w:r>
-      <w:proofErr w:type="gramEnd"/>
-      <w:r>
-        <w:t xml:space="preserve"> setiap baris pada account mengukur indikator keuangan yang berbeda, dalam data dituliskan dalam bahasa </w:t>
-      </w:r>
-      <w:proofErr w:type="gramStart"/>
-      <w:r>
-        <w:t>inggris..</w:t>
-      </w:r>
-      <w:proofErr w:type="gramEnd"/>
+        <w:t>Kolom kedua berisikan account atau biasa dikenal juga dengan indikator keuangan , setiap baris pada account mengukur indikator keuangan yang berbeda, dalam data dituliskan dalam bahasa inggris..</w:t>
+      </w:r>
     </w:p>
     <w:p/>
     <w:tbl>
@@ -613,15 +579,7 @@
           </w:tcPr>
           <w:p>
             <w:r>
-              <w:t xml:space="preserve">Additional Paid </w:t>
-            </w:r>
-            <w:proofErr w:type="gramStart"/>
-            <w:r>
-              <w:t>In</w:t>
-            </w:r>
-            <w:proofErr w:type="gramEnd"/>
-            <w:r>
-              <w:t xml:space="preserve"> Capital (PIC) / Share Premium</w:t>
+              <w:t>Additional Paid In Capital (PIC) / Share Premium</w:t>
             </w:r>
           </w:p>
         </w:tc>
@@ -666,15 +624,7 @@
     <w:p/>
     <w:p>
       <w:r>
-        <w:t xml:space="preserve">Totalnya </w:t>
-      </w:r>
-      <w:proofErr w:type="gramStart"/>
-      <w:r>
-        <w:t>terdapat  264</w:t>
-      </w:r>
-      <w:proofErr w:type="gramEnd"/>
-      <w:r>
-        <w:t xml:space="preserve"> indikator keuangan atau account</w:t>
+        <w:t>Totalnya terdapat  264 indikator keuangan atau account</w:t>
       </w:r>
     </w:p>
     <w:p>
@@ -764,40 +714,14 @@
     </w:p>
     <w:p>
       <w:r>
-        <w:t xml:space="preserve">Pada data mentah terdapat beberapa akun yang memiliki kekosongan data (tidak lengkap) dialasankan karena tidak kelengkapan atau tidak ditemukanya indikator keuangan pada laporan keuangan </w:t>
-      </w:r>
-      <w:proofErr w:type="gramStart"/>
-      <w:r>
-        <w:t>perusahaan..</w:t>
-      </w:r>
-      <w:proofErr w:type="gramEnd"/>
+        <w:t>Pada data mentah terdapat beberapa akun yang memiliki kekosongan data (tidak lengkap) dialasankan karena tidak kelengkapan atau tidak ditemukanya indikator keuangan pada laporan keuangan perusahaan..</w:t>
+      </w:r>
     </w:p>
     <w:p/>
     <w:p>
       <w:r>
-        <w:t xml:space="preserve">Selanjutnya adalah kolom ketiga atau kolom </w:t>
-      </w:r>
-      <w:proofErr w:type="gramStart"/>
-      <w:r>
-        <w:t>type ,</w:t>
-      </w:r>
-      <w:proofErr w:type="gramEnd"/>
-      <w:r>
-        <w:t xml:space="preserve"> ini berisi jenis laporan keuangan tempat data (account) itu </w:t>
-      </w:r>
-      <w:proofErr w:type="gramStart"/>
-      <w:r>
-        <w:t>berasal ,</w:t>
-      </w:r>
-      <w:proofErr w:type="gramEnd"/>
-      <w:r>
-        <w:t xml:space="preserve"> dalam ilmu keuangan terdapat 3 laporan </w:t>
-      </w:r>
-      <w:proofErr w:type="gramStart"/>
-      <w:r>
-        <w:t>utama :</w:t>
-      </w:r>
-      <w:proofErr w:type="gramEnd"/>
+        <w:t>Selanjutnya adalah kolom ketiga atau kolom type , ini berisi jenis laporan keuangan tempat data (account) itu berasal , dalam ilmu keuangan terdapat 3 laporan utama :</w:t>
+      </w:r>
     </w:p>
     <w:tbl>
       <w:tblPr>
@@ -1222,15 +1146,7 @@
     <w:p/>
     <w:p>
       <w:r>
-        <w:t xml:space="preserve">Selanjutnya adalah kolom </w:t>
-      </w:r>
-      <w:proofErr w:type="gramStart"/>
-      <w:r>
-        <w:t>tahun ,</w:t>
-      </w:r>
-      <w:proofErr w:type="gramEnd"/>
-      <w:r>
-        <w:t xml:space="preserve"> terdiri dari tahun 2020-2023 (total 4 tahun)</w:t>
+        <w:t>Selanjutnya adalah kolom tahun , terdiri dari tahun 2020-2023 (total 4 tahun)</w:t>
       </w:r>
     </w:p>
     <w:p>
@@ -1280,61 +1196,13 @@
     </w:p>
     <w:p>
       <w:r>
-        <w:t xml:space="preserve">Pada tabel tahun berisi nilai uang (rupiah) dari account yang bersangkutan pada tahun </w:t>
-      </w:r>
-      <w:proofErr w:type="gramStart"/>
-      <w:r>
-        <w:t>tersebut..</w:t>
-      </w:r>
-      <w:proofErr w:type="gramEnd"/>
-      <w:r>
-        <w:t xml:space="preserve"> jadi misal tahun 2020 tercatat 770 milliar, ya </w:t>
-      </w:r>
-      <w:proofErr w:type="gramStart"/>
-      <w:r>
-        <w:t>artinya  Accounts</w:t>
-      </w:r>
-      <w:proofErr w:type="gramEnd"/>
-      <w:r>
-        <w:t xml:space="preserve"> </w:t>
-      </w:r>
-      <w:proofErr w:type="gramStart"/>
-      <w:r>
-        <w:t>Payable  pada</w:t>
-      </w:r>
-      <w:proofErr w:type="gramEnd"/>
-      <w:r>
-        <w:t xml:space="preserve"> perusahaan </w:t>
-      </w:r>
-      <w:proofErr w:type="gramStart"/>
-      <w:r>
-        <w:t>AALI  sebesar</w:t>
-      </w:r>
-      <w:proofErr w:type="gramEnd"/>
-      <w:r>
-        <w:t xml:space="preserve"> 770 milliar pada tahun </w:t>
-      </w:r>
-      <w:proofErr w:type="gramStart"/>
-      <w:r>
-        <w:t>2020..</w:t>
-      </w:r>
-      <w:proofErr w:type="gramEnd"/>
-      <w:r>
-        <w:t xml:space="preserve"> hal yang sama berlaku juga pada tahun tahun berikutnya.</w:t>
+        <w:t>Pada tabel tahun berisi nilai uang (rupiah) dari account yang bersangkutan pada tahun tersebut.. jadi misal tahun 2020 tercatat 770 milliar, ya artinya  Accounts Payable  pada perusahaan AALI  sebesar 770 milliar pada tahun 2020.. hal yang sama berlaku juga pada tahun tahun berikutnya.</w:t>
       </w:r>
     </w:p>
     <w:p>
       <w:r>
         <w:lastRenderedPageBreak/>
-        <w:t xml:space="preserve">Terdapat masalah cukup serius pada tabel </w:t>
-      </w:r>
-      <w:proofErr w:type="gramStart"/>
-      <w:r>
-        <w:t>tahun ,</w:t>
-      </w:r>
-      <w:proofErr w:type="gramEnd"/>
-      <w:r>
-        <w:t xml:space="preserve"> dimana pada data mentah didapati </w:t>
+        <w:t xml:space="preserve">Terdapat masalah cukup serius pada tabel tahun , dimana pada data mentah didapati </w:t>
       </w:r>
       <w:r>
         <w:rPr>
@@ -1379,40 +1247,14 @@
     </w:p>
     <w:p>
       <w:r>
-        <w:t xml:space="preserve">5255 missing value pada tahun 2020, 4769 missing value pada </w:t>
-      </w:r>
-      <w:proofErr w:type="gramStart"/>
-      <w:r>
-        <w:t>2021 ,</w:t>
-      </w:r>
-      <w:proofErr w:type="gramEnd"/>
-      <w:r>
-        <w:t xml:space="preserve"> 5609 pada tahun 2022 dan yang paling besar 19412 pada tahun </w:t>
-      </w:r>
-      <w:proofErr w:type="gramStart"/>
-      <w:r>
-        <w:t>2023..</w:t>
-      </w:r>
-      <w:proofErr w:type="gramEnd"/>
-      <w:r>
-        <w:t xml:space="preserve"> hal ini menjadi tantangan pada tahap manipulasi data </w:t>
-      </w:r>
-      <w:proofErr w:type="gramStart"/>
-      <w:r>
-        <w:t>nantinya..</w:t>
-      </w:r>
-      <w:proofErr w:type="gramEnd"/>
+        <w:t>5255 missing value pada tahun 2020, 4769 missing value pada 2021 , 5609 pada tahun 2022 dan yang paling besar 19412 pada tahun 2023.. hal ini menjadi tantangan pada tahap manipulasi data nantinya..</w:t>
+      </w:r>
     </w:p>
     <w:p/>
     <w:p>
       <w:r>
-        <w:t xml:space="preserve">Output yang ingin dicapai sebagai </w:t>
-      </w:r>
-      <w:proofErr w:type="gramStart"/>
-      <w:r>
-        <w:t>berikut :</w:t>
-      </w:r>
-      <w:proofErr w:type="gramEnd"/>
+        <w:t>Output yang ingin dicapai sebagai berikut :</w:t>
+      </w:r>
     </w:p>
     <w:p>
       <w:pPr>
@@ -1423,18 +1265,10 @@
         </w:numPr>
       </w:pPr>
       <w:r>
-        <w:t>Klasterisasi Profil Kesehatan Finansial (Algoritma K-Means</w:t>
-      </w:r>
-      <w:proofErr w:type="gramStart"/>
-      <w:r>
-        <w:t>)</w:t>
-      </w:r>
-      <w:r>
-        <w:t xml:space="preserve"> :</w:t>
-      </w:r>
-      <w:proofErr w:type="gramEnd"/>
-      <w:r>
-        <w:t xml:space="preserve"> </w:t>
+        <w:t>Klasterisasi Profil Kesehatan Finansial (Algoritma K-Means)</w:t>
+      </w:r>
+      <w:r>
+        <w:t xml:space="preserve"> : </w:t>
       </w:r>
       <w:r>
         <w:t xml:space="preserve">Output yang dihasilkan: Pengelompokan 604 perusahaan ke dalam 3 atau 4 kategori (Misal: </w:t>
@@ -1479,18 +1313,10 @@
         </w:numPr>
       </w:pPr>
       <w:r>
-        <w:t>Prediksi Kinerja / Laba Saham (Algoritma Regresi Linear</w:t>
-      </w:r>
-      <w:proofErr w:type="gramStart"/>
-      <w:r>
-        <w:t>)</w:t>
-      </w:r>
-      <w:r>
-        <w:t xml:space="preserve"> :</w:t>
-      </w:r>
-      <w:proofErr w:type="gramEnd"/>
-      <w:r>
-        <w:t xml:space="preserve"> </w:t>
+        <w:t>Prediksi Kinerja / Laba Saham (Algoritma Regresi Linear)</w:t>
+      </w:r>
+      <w:r>
+        <w:t xml:space="preserve"> : </w:t>
       </w:r>
       <w:r>
         <w:t>Output yang dihasilkan: Prediksi angka Basic EPS (Earning Per Share) untuk tahun 2024.</w:t>
@@ -1526,13 +1352,8 @@
         <w:ind w:left="142"/>
       </w:pPr>
       <w:r>
-        <w:t xml:space="preserve">Tahapan alur </w:t>
-      </w:r>
-      <w:proofErr w:type="gramStart"/>
-      <w:r>
-        <w:t>kerja :</w:t>
-      </w:r>
-      <w:proofErr w:type="gramEnd"/>
+        <w:t>Tahapan alur kerja :</w:t>
+      </w:r>
     </w:p>
     <w:p>
       <w:pPr>
@@ -1597,15 +1418,7 @@
         <w:ind w:left="709"/>
       </w:pPr>
       <w:r>
-        <w:t xml:space="preserve">Fase </w:t>
-      </w:r>
-      <w:proofErr w:type="gramStart"/>
-      <w:r>
-        <w:t>deploy</w:t>
-      </w:r>
-      <w:proofErr w:type="gramEnd"/>
-      <w:r>
-        <w:t xml:space="preserve"> (dijadiin dashboard)</w:t>
+        <w:t>Fase deploy (dijadiin dashboard)</w:t>
       </w:r>
     </w:p>
     <w:p>
@@ -1685,18 +1498,10 @@
         <w:ind w:left="709"/>
       </w:pPr>
       <w:r>
-        <w:t>Metodologi yang digunakan adalah crisp -</w:t>
-      </w:r>
-      <w:proofErr w:type="gramStart"/>
-      <w:r>
-        <w:t>dm</w:t>
-      </w:r>
-      <w:r>
-        <w:t xml:space="preserve"> :</w:t>
-      </w:r>
-      <w:proofErr w:type="gramEnd"/>
-      <w:r>
-        <w:t xml:space="preserve"> </w:t>
+        <w:t>Metodologi yang digunakan adalah crisp -dm</w:t>
+      </w:r>
+      <w:r>
+        <w:t xml:space="preserve"> : </w:t>
       </w:r>
     </w:p>
     <w:p>
@@ -1770,23 +1575,7 @@
         <w:ind w:left="709"/>
       </w:pPr>
       <w:r>
-        <w:t xml:space="preserve">Setelah kita sudah memahami data dan merancang </w:t>
-      </w:r>
-      <w:proofErr w:type="gramStart"/>
-      <w:r>
-        <w:t>capaian ,</w:t>
-      </w:r>
-      <w:proofErr w:type="gramEnd"/>
-      <w:r>
-        <w:t xml:space="preserve"> </w:t>
-      </w:r>
-      <w:proofErr w:type="gramStart"/>
-      <w:r>
-        <w:t>metode ,</w:t>
-      </w:r>
-      <w:proofErr w:type="gramEnd"/>
-      <w:r>
-        <w:t xml:space="preserve"> dan alur kerja, maka sudah saat nya kita masuk ke tahap eksekusi </w:t>
+        <w:t xml:space="preserve">Setelah kita sudah memahami data dan merancang capaian , metode , dan alur kerja, maka sudah saat nya kita masuk ke tahap eksekusi </w:t>
       </w:r>
     </w:p>
     <w:p>
@@ -1858,7 +1647,6 @@
           <w:bCs/>
         </w:rPr>
       </w:pPr>
-      <w:proofErr w:type="gramStart"/>
       <w:r>
         <w:rPr>
           <w:b/>
@@ -1867,7 +1655,6 @@
         <w:lastRenderedPageBreak/>
         <w:t>EXCECUTION :</w:t>
       </w:r>
-      <w:proofErr w:type="gramEnd"/>
     </w:p>
     <w:p>
       <w:pPr>
@@ -1918,23 +1705,7 @@
           <w:sz w:val="26"/>
           <w:szCs w:val="26"/>
         </w:rPr>
-        <w:t xml:space="preserve">Langkah pertama dalam pembersihan data adalah dengan melakukan pengecekan pada data duplikat, dan penghapusan data duplikat, setelah </w:t>
-      </w:r>
-      <w:proofErr w:type="gramStart"/>
-      <w:r>
-        <w:rPr>
-          <w:sz w:val="26"/>
-          <w:szCs w:val="26"/>
-        </w:rPr>
-        <w:t>dianalisa ,</w:t>
-      </w:r>
-      <w:proofErr w:type="gramEnd"/>
-      <w:r>
-        <w:rPr>
-          <w:sz w:val="26"/>
-          <w:szCs w:val="26"/>
-        </w:rPr>
-        <w:t xml:space="preserve"> hasil yang didapatkan </w:t>
+        <w:t xml:space="preserve">Langkah pertama dalam pembersihan data adalah dengan melakukan pengecekan pada data duplikat, dan penghapusan data duplikat, setelah dianalisa , hasil yang didapatkan </w:t>
       </w:r>
       <w:r>
         <w:rPr>
@@ -2019,23 +1790,7 @@
           <w:sz w:val="26"/>
           <w:szCs w:val="26"/>
         </w:rPr>
-        <w:t xml:space="preserve">Setelah melalui proses remove </w:t>
-      </w:r>
-      <w:proofErr w:type="gramStart"/>
-      <w:r>
-        <w:rPr>
-          <w:sz w:val="26"/>
-          <w:szCs w:val="26"/>
-        </w:rPr>
-        <w:t>duplicates :</w:t>
-      </w:r>
-      <w:proofErr w:type="gramEnd"/>
-      <w:r>
-        <w:rPr>
-          <w:sz w:val="26"/>
-          <w:szCs w:val="26"/>
-        </w:rPr>
-        <w:t xml:space="preserve"> total baris tetap sama dan tidak ada perubahan</w:t>
+        <w:t>Setelah melalui proses remove duplicates : total baris tetap sama dan tidak ada perubahan</w:t>
       </w:r>
     </w:p>
     <w:p>
@@ -2062,39 +1817,7 @@
           <w:sz w:val="26"/>
           <w:szCs w:val="26"/>
         </w:rPr>
-        <w:t xml:space="preserve">Setelah melakukan penghapusan duplikasi, langkah selanjutnya adalah menghapus akun / account / indikator keuangan yang tidak diperlukan, diketahui total ada 264 </w:t>
-      </w:r>
-      <w:proofErr w:type="gramStart"/>
-      <w:r>
-        <w:rPr>
-          <w:sz w:val="26"/>
-          <w:szCs w:val="26"/>
-        </w:rPr>
-        <w:t>akun ,</w:t>
-      </w:r>
-      <w:proofErr w:type="gramEnd"/>
-      <w:r>
-        <w:rPr>
-          <w:sz w:val="26"/>
-          <w:szCs w:val="26"/>
-        </w:rPr>
-        <w:t xml:space="preserve"> dan yang digunakan hanya 21 akun untuk </w:t>
-      </w:r>
-      <w:proofErr w:type="gramStart"/>
-      <w:r>
-        <w:rPr>
-          <w:sz w:val="26"/>
-          <w:szCs w:val="26"/>
-        </w:rPr>
-        <w:t>keperluan..</w:t>
-      </w:r>
-      <w:proofErr w:type="gramEnd"/>
-      <w:r>
-        <w:rPr>
-          <w:sz w:val="26"/>
-          <w:szCs w:val="26"/>
-        </w:rPr>
-        <w:t xml:space="preserve"> </w:t>
+        <w:t xml:space="preserve">Setelah melakukan penghapusan duplikasi, langkah selanjutnya adalah menghapus akun / account / indikator keuangan yang tidak diperlukan, diketahui total ada 264 akun , dan yang digunakan hanya 21 akun untuk keperluan.. </w:t>
       </w:r>
     </w:p>
     <w:p>
@@ -2617,23 +2340,7 @@
           <w:sz w:val="26"/>
           <w:szCs w:val="26"/>
         </w:rPr>
-        <w:t xml:space="preserve">Cash Flow </w:t>
-      </w:r>
-      <w:proofErr w:type="gramStart"/>
-      <w:r>
-        <w:rPr>
-          <w:sz w:val="26"/>
-          <w:szCs w:val="26"/>
-        </w:rPr>
-        <w:t>From</w:t>
-      </w:r>
-      <w:proofErr w:type="gramEnd"/>
-      <w:r>
-        <w:rPr>
-          <w:sz w:val="26"/>
-          <w:szCs w:val="26"/>
-        </w:rPr>
-        <w:t xml:space="preserve"> Operating Activities: Uang tunai yang benar-benar masuk dari bisnis inti.</w:t>
+        <w:t>Cash Flow From Operating Activities: Uang tunai yang benar-benar masuk dari bisnis inti.</w:t>
       </w:r>
     </w:p>
     <w:p>
@@ -2673,23 +2380,7 @@
           <w:sz w:val="26"/>
           <w:szCs w:val="26"/>
         </w:rPr>
-        <w:t xml:space="preserve">Cash Flow </w:t>
-      </w:r>
-      <w:proofErr w:type="gramStart"/>
-      <w:r>
-        <w:rPr>
-          <w:sz w:val="26"/>
-          <w:szCs w:val="26"/>
-        </w:rPr>
-        <w:t>From</w:t>
-      </w:r>
-      <w:proofErr w:type="gramEnd"/>
-      <w:r>
-        <w:rPr>
-          <w:sz w:val="26"/>
-          <w:szCs w:val="26"/>
-        </w:rPr>
-        <w:t xml:space="preserve"> Financing Activities: Uang dari pinjaman bank atau penerbitan saham.</w:t>
+        <w:t>Cash Flow From Financing Activities: Uang dari pinjaman bank atau penerbitan saham.</w:t>
       </w:r>
     </w:p>
     <w:p>
@@ -2851,15 +2542,7 @@
         <w:ind w:left="1069"/>
       </w:pPr>
       <w:r>
-        <w:t xml:space="preserve">Selanjutnya adalah melakukan filterisasi terhadap perusahaan yang tidak memiliki kelengkapan </w:t>
-      </w:r>
-      <w:proofErr w:type="gramStart"/>
-      <w:r>
-        <w:t>dalam  pencatatan</w:t>
-      </w:r>
-      <w:proofErr w:type="gramEnd"/>
-      <w:r>
-        <w:t xml:space="preserve"> nilai keuangan, dengan syarat missing value terdapat 3 tahun, yang artinya data perusahaan cacat atau tidak beroperasi pada tahun tersebut</w:t>
+        <w:t>Selanjutnya adalah melakukan filterisasi terhadap perusahaan yang tidak memiliki kelengkapan dalam  pencatatan nilai keuangan, dengan syarat missing value terdapat 3 tahun, yang artinya data perusahaan cacat atau tidak beroperasi pada tahun tersebut</w:t>
       </w:r>
     </w:p>
     <w:p>
@@ -2874,15 +2557,7 @@
         <w:ind w:left="1069"/>
       </w:pPr>
       <w:r>
-        <w:t xml:space="preserve">Contoh data perusahaan yang </w:t>
-      </w:r>
-      <w:proofErr w:type="gramStart"/>
-      <w:r>
-        <w:t>dihapus :</w:t>
-      </w:r>
-      <w:proofErr w:type="gramEnd"/>
-      <w:r>
-        <w:t xml:space="preserve"> </w:t>
+        <w:t xml:space="preserve">Contoh data perusahaan yang dihapus : </w:t>
       </w:r>
     </w:p>
     <w:p>
@@ -2933,15 +2608,7 @@
     </w:p>
     <w:p>
       <w:r>
-        <w:t xml:space="preserve">Dari syarat diatas, ditemukan 9 perusahaan </w:t>
-      </w:r>
-      <w:proofErr w:type="gramStart"/>
-      <w:r>
-        <w:t>cacat :</w:t>
-      </w:r>
-      <w:proofErr w:type="gramEnd"/>
-      <w:r>
-        <w:t xml:space="preserve">  </w:t>
+        <w:t xml:space="preserve">Dari syarat diatas, ditemukan 9 perusahaan cacat :  </w:t>
       </w:r>
       <w:r>
         <w:t>army, goll, hotl, inet, lcgp, magp, tram, tril, tifa</w:t>
@@ -3053,64 +2720,24 @@
     </w:p>
     <w:p>
       <w:r>
-        <w:t xml:space="preserve">Maka cara penangananya yang paling idel adalah menggunakan </w:t>
-      </w:r>
-      <w:proofErr w:type="gramStart"/>
-      <w:r>
-        <w:t xml:space="preserve">metode </w:t>
-      </w:r>
-      <w:r>
-        <w:t xml:space="preserve"> Imputasi</w:t>
-      </w:r>
-      <w:proofErr w:type="gramEnd"/>
-      <w:r>
-        <w:t xml:space="preserve"> </w:t>
+        <w:t xml:space="preserve">Maka cara penangananya yang paling idel adalah menggunakan metode </w:t>
+      </w:r>
+      <w:r>
+        <w:t xml:space="preserve"> Imputasi </w:t>
       </w:r>
       <w:r>
         <w:rPr>
           <w:i/>
           <w:iCs/>
         </w:rPr>
-        <w:t xml:space="preserve">Previous </w:t>
-      </w:r>
-      <w:proofErr w:type="gramStart"/>
+        <w:t>Previous Value</w:t>
+      </w:r>
       <w:r>
         <w:rPr>
           <w:i/>
           <w:iCs/>
         </w:rPr>
-        <w:t>Value</w:t>
-      </w:r>
-      <w:r>
-        <w:rPr>
-          <w:i/>
-          <w:iCs/>
-        </w:rPr>
-        <w:t xml:space="preserve"> ,</w:t>
-      </w:r>
-      <w:proofErr w:type="gramEnd"/>
-      <w:r>
-        <w:rPr>
-          <w:i/>
-          <w:iCs/>
-        </w:rPr>
-        <w:t xml:space="preserve"> jadi misal tahun 2023 kosong sedangkan tahun 2022 </w:t>
-      </w:r>
-      <w:proofErr w:type="gramStart"/>
-      <w:r>
-        <w:rPr>
-          <w:i/>
-          <w:iCs/>
-        </w:rPr>
-        <w:t>ada ,</w:t>
-      </w:r>
-      <w:proofErr w:type="gramEnd"/>
-      <w:r>
-        <w:rPr>
-          <w:i/>
-          <w:iCs/>
-        </w:rPr>
-        <w:t xml:space="preserve"> maka angka di 2023 diisi dengan thaun 2022</w:t>
+        <w:t xml:space="preserve"> , jadi misal tahun 2023 kosong sedangkan tahun 2022 ada , maka angka di 2023 diisi dengan thaun 2022</w:t>
       </w:r>
       <w:r>
         <w:t xml:space="preserve"> hal ini lebih masuk akal karena jika dihapus semua missing value, maka bisa kehilangan setengah data yang sudah ada.</w:t>
@@ -3179,37 +2806,13 @@
     <w:p>
       <w:r>
         <w:lastRenderedPageBreak/>
-        <w:t xml:space="preserve">Penggunaan rumus, </w:t>
-      </w:r>
-      <w:proofErr w:type="gramStart"/>
-      <w:r>
-        <w:t>cth :</w:t>
-      </w:r>
-      <w:proofErr w:type="gramEnd"/>
-      <w:r>
-        <w:t xml:space="preserve"> jika 2020 kosong maka diisi 2021, jika 2021 juga kosong diisi 2022 dan </w:t>
-      </w:r>
-      <w:proofErr w:type="gramStart"/>
-      <w:r>
-        <w:t>seterusnya..</w:t>
-      </w:r>
-      <w:proofErr w:type="gramEnd"/>
-      <w:r>
-        <w:t xml:space="preserve"> (imputasi previous or after value)</w:t>
+        <w:t>Penggunaan rumus, cth : jika 2020 kosong maka diisi 2021, jika 2021 juga kosong diisi 2022 dan seterusnya.. (imputasi previous or after value)</w:t>
       </w:r>
     </w:p>
     <w:p/>
     <w:p>
       <w:r>
-        <w:t xml:space="preserve">Maka sekarang didapati missing </w:t>
-      </w:r>
-      <w:proofErr w:type="gramStart"/>
-      <w:r>
-        <w:t>attributes  bernilai</w:t>
-      </w:r>
-      <w:proofErr w:type="gramEnd"/>
-      <w:r>
-        <w:t xml:space="preserve"> 0 dari 11,388</w:t>
+        <w:t>Maka sekarang didapati missing attributes  bernilai 0 dari 11,388</w:t>
       </w:r>
       <w:r>
         <w:rPr>
@@ -3394,23 +2997,7 @@
       </w:r>
       <w:r>
         <w:lastRenderedPageBreak/>
-        <w:t xml:space="preserve">dihasilkan masih </w:t>
-      </w:r>
-      <w:proofErr w:type="gramStart"/>
-      <w:r>
-        <w:t>berupa  long</w:t>
-      </w:r>
-      <w:proofErr w:type="gramEnd"/>
-      <w:r>
-        <w:t xml:space="preserve"> format seperti </w:t>
-      </w:r>
-      <w:proofErr w:type="gramStart"/>
-      <w:r>
-        <w:t>ini :</w:t>
-      </w:r>
-      <w:proofErr w:type="gramEnd"/>
-      <w:r>
-        <w:t xml:space="preserve"> </w:t>
+        <w:t xml:space="preserve">dihasilkan masih berupa  long format seperti ini : </w:t>
       </w:r>
       <w:r>
         <w:rPr>
@@ -3455,15 +3042,7 @@
     </w:p>
     <w:p>
       <w:r>
-        <w:t xml:space="preserve">setelah melakukan </w:t>
-      </w:r>
-      <w:proofErr w:type="gramStart"/>
-      <w:r>
-        <w:t>pivoting :</w:t>
-      </w:r>
-      <w:proofErr w:type="gramEnd"/>
-      <w:r>
-        <w:t xml:space="preserve"> </w:t>
+        <w:t xml:space="preserve">setelah melakukan pivoting : </w:t>
       </w:r>
       <w:r>
         <w:rPr>
@@ -3508,15 +3087,7 @@
     </w:p>
     <w:p>
       <w:r>
-        <w:t xml:space="preserve">dan selanjutnya melakukan replace missing value dengan angka </w:t>
-      </w:r>
-      <w:proofErr w:type="gramStart"/>
-      <w:r>
-        <w:t>0 ,</w:t>
-      </w:r>
-      <w:proofErr w:type="gramEnd"/>
-      <w:r>
-        <w:t xml:space="preserve"> terdapat beberapa missing values, hal ini wajar karena </w:t>
+        <w:t xml:space="preserve">dan selanjutnya melakukan replace missing value dengan angka 0 , terdapat beberapa missing values, hal ini wajar karena </w:t>
       </w:r>
       <w:r>
         <w:t xml:space="preserve">Tidak semua </w:t>
@@ -3543,15 +3114,7 @@
         <w:t xml:space="preserve"> </w:t>
       </w:r>
       <w:r>
-        <w:t xml:space="preserve">Contoh nyata: Perusahaan di sektor perbankan (seperti BBCA) tidak memiliki akun Cost </w:t>
-      </w:r>
-      <w:proofErr w:type="gramStart"/>
-      <w:r>
-        <w:t>Of</w:t>
-      </w:r>
-      <w:proofErr w:type="gramEnd"/>
-      <w:r>
-        <w:t xml:space="preserve"> Revenue (Beban Pokok Penjualan) atau Gross Profit (Laba Kotor) karena bisnis mereka adalah jasa keuangan, bukan jualan barang fisik.</w:t>
+        <w:t>Contoh nyata: Perusahaan di sektor perbankan (seperti BBCA) tidak memiliki akun Cost Of Revenue (Beban Pokok Penjualan) atau Gross Profit (Laba Kotor) karena bisnis mereka adalah jasa keuangan, bukan jualan barang fisik.</w:t>
       </w:r>
     </w:p>
     <w:p>
@@ -3670,14 +3233,9 @@
           <w:numId w:val="12"/>
         </w:numPr>
       </w:pPr>
-      <w:proofErr w:type="gramStart"/>
       <w:r>
         <w:lastRenderedPageBreak/>
-        <w:t>sum(2023)_</w:t>
-      </w:r>
-      <w:proofErr w:type="gramEnd"/>
-      <w:r>
-        <w:t>Total Assets</w:t>
+        <w:t>sum(2023)_Total Assets</w:t>
       </w:r>
     </w:p>
     <w:p>
@@ -3688,13 +3246,8 @@
           <w:numId w:val="12"/>
         </w:numPr>
       </w:pPr>
-      <w:proofErr w:type="gramStart"/>
-      <w:r>
-        <w:t>sum(2023)_</w:t>
-      </w:r>
-      <w:proofErr w:type="gramEnd"/>
-      <w:r>
-        <w:t>Total Liabilities Net Minority Interest</w:t>
+      <w:r>
+        <w:t>sum(2023)_Total Liabilities Net Minority Interest</w:t>
       </w:r>
     </w:p>
     <w:p>
@@ -3705,13 +3258,8 @@
           <w:numId w:val="12"/>
         </w:numPr>
       </w:pPr>
-      <w:proofErr w:type="gramStart"/>
-      <w:r>
-        <w:t>sum(2023)_</w:t>
-      </w:r>
-      <w:proofErr w:type="gramEnd"/>
-      <w:r>
-        <w:t>Total Equity Gross Minority Interest</w:t>
+      <w:r>
+        <w:t>sum(2023)_Total Equity Gross Minority Interest</w:t>
       </w:r>
     </w:p>
     <w:p>
@@ -3722,13 +3270,8 @@
           <w:numId w:val="12"/>
         </w:numPr>
       </w:pPr>
-      <w:proofErr w:type="gramStart"/>
-      <w:r>
-        <w:t>sum(2023)_</w:t>
-      </w:r>
-      <w:proofErr w:type="gramEnd"/>
-      <w:r>
-        <w:t>Current Assets</w:t>
+      <w:r>
+        <w:t>sum(2023)_Current Assets</w:t>
       </w:r>
     </w:p>
     <w:p>
@@ -3739,13 +3282,8 @@
           <w:numId w:val="12"/>
         </w:numPr>
       </w:pPr>
-      <w:proofErr w:type="gramStart"/>
-      <w:r>
-        <w:t>sum(2023)_</w:t>
-      </w:r>
-      <w:proofErr w:type="gramEnd"/>
-      <w:r>
-        <w:t>Current Liabilities</w:t>
+      <w:r>
+        <w:t>sum(2023)_Current Liabilities</w:t>
       </w:r>
     </w:p>
     <w:p>
@@ -3756,13 +3294,8 @@
           <w:numId w:val="12"/>
         </w:numPr>
       </w:pPr>
-      <w:proofErr w:type="gramStart"/>
-      <w:r>
-        <w:t>sum(2023)_</w:t>
-      </w:r>
-      <w:proofErr w:type="gramEnd"/>
-      <w:r>
-        <w:t>Total Revenue</w:t>
+      <w:r>
+        <w:t>sum(2023)_Total Revenue</w:t>
       </w:r>
     </w:p>
     <w:p>
@@ -3773,13 +3306,8 @@
           <w:numId w:val="12"/>
         </w:numPr>
       </w:pPr>
-      <w:proofErr w:type="gramStart"/>
-      <w:r>
-        <w:t>sum(2023)_</w:t>
-      </w:r>
-      <w:proofErr w:type="gramEnd"/>
-      <w:r>
-        <w:t>Net Income</w:t>
+      <w:r>
+        <w:t>sum(2023)_Net Income</w:t>
       </w:r>
     </w:p>
     <w:p>
@@ -3790,13 +3318,8 @@
           <w:numId w:val="12"/>
         </w:numPr>
       </w:pPr>
-      <w:proofErr w:type="gramStart"/>
-      <w:r>
-        <w:t>sum(2023)_</w:t>
-      </w:r>
-      <w:proofErr w:type="gramEnd"/>
-      <w:r>
-        <w:t>End Cash Position</w:t>
+      <w:r>
+        <w:t>sum(2023)_End Cash Position</w:t>
       </w:r>
     </w:p>
     <w:p/>
@@ -3807,19 +3330,14 @@
     </w:p>
     <w:p>
       <w:r>
-        <w:t xml:space="preserve">didapati </w:t>
-      </w:r>
-      <w:proofErr w:type="gramStart"/>
-      <w:r>
-        <w:t>hasil :</w:t>
-      </w:r>
-      <w:proofErr w:type="gramEnd"/>
-      <w:r>
-        <w:t xml:space="preserve"> </w:t>
-      </w:r>
-    </w:p>
-    <w:p>
-      <w:r>
+        <w:t xml:space="preserve">didapati hasil : </w:t>
+      </w:r>
+    </w:p>
+    <w:p>
+      <w:r>
+        <w:rPr>
+          <w:noProof/>
+        </w:rPr>
         <w:drawing>
           <wp:inline distT="0" distB="0" distL="0" distR="0" wp14:anchorId="23708E7A" wp14:editId="30169C4A">
             <wp:extent cx="3543795" cy="2152950"/>
@@ -3859,6 +3377,9 @@
     </w:p>
     <w:p>
       <w:r>
+        <w:rPr>
+          <w:noProof/>
+        </w:rPr>
         <w:drawing>
           <wp:inline distT="0" distB="0" distL="0" distR="0" wp14:anchorId="32255F9B" wp14:editId="513CDE0C">
             <wp:extent cx="1525495" cy="2342271"/>
@@ -3900,6 +3421,9 @@
     <w:p/>
     <w:p>
       <w:r>
+        <w:rPr>
+          <w:noProof/>
+        </w:rPr>
         <w:lastRenderedPageBreak/>
         <w:drawing>
           <wp:inline distT="0" distB="0" distL="0" distR="0" wp14:anchorId="464B63C8" wp14:editId="05D32D6F">
@@ -3940,29 +3464,19 @@
     </w:p>
     <w:p>
       <w:r>
-        <w:t xml:space="preserve">Selanjutnya adalah analisis regresi </w:t>
-      </w:r>
-      <w:proofErr w:type="gramStart"/>
-      <w:r>
-        <w:t>liner :</w:t>
-      </w:r>
-      <w:proofErr w:type="gramEnd"/>
-    </w:p>
-    <w:p>
-      <w:r>
-        <w:t xml:space="preserve">Didapati </w:t>
-      </w:r>
-      <w:proofErr w:type="gramStart"/>
-      <w:r>
-        <w:t>hasil :</w:t>
-      </w:r>
-      <w:proofErr w:type="gramEnd"/>
-      <w:r>
-        <w:t xml:space="preserve"> </w:t>
-      </w:r>
-    </w:p>
-    <w:p>
-      <w:r>
+        <w:t>Selanjutnya adalah analisis regresi liner :</w:t>
+      </w:r>
+    </w:p>
+    <w:p>
+      <w:r>
+        <w:t xml:space="preserve">Didapati hasil : </w:t>
+      </w:r>
+    </w:p>
+    <w:p>
+      <w:r>
+        <w:rPr>
+          <w:noProof/>
+        </w:rPr>
         <w:drawing>
           <wp:inline distT="0" distB="0" distL="0" distR="0" wp14:anchorId="4A4CCC25" wp14:editId="2E7F034A">
             <wp:extent cx="5943600" cy="1393190"/>
@@ -4002,6 +3516,9 @@
     </w:p>
     <w:p>
       <w:r>
+        <w:rPr>
+          <w:noProof/>
+        </w:rPr>
         <w:drawing>
           <wp:inline distT="0" distB="0" distL="0" distR="0" wp14:anchorId="10CDE75B" wp14:editId="4631497A">
             <wp:extent cx="4267796" cy="2619741"/>
@@ -4047,19 +3564,14 @@
     <w:p/>
     <w:p>
       <w:r>
-        <w:t xml:space="preserve">Maka telah </w:t>
-      </w:r>
-      <w:proofErr w:type="gramStart"/>
-      <w:r>
-        <w:t>selesai ,</w:t>
-      </w:r>
-      <w:proofErr w:type="gramEnd"/>
-      <w:r>
-        <w:t xml:space="preserve"> seluruh proses di rapid miner</w:t>
-      </w:r>
-    </w:p>
-    <w:p>
-      <w:r>
+        <w:t>Maka telah selesai , seluruh proses di rapid miner</w:t>
+      </w:r>
+    </w:p>
+    <w:p>
+      <w:r>
+        <w:rPr>
+          <w:noProof/>
+        </w:rPr>
         <w:drawing>
           <wp:inline distT="0" distB="0" distL="0" distR="0" wp14:anchorId="3CD8072E" wp14:editId="7827B01B">
             <wp:extent cx="5943600" cy="2852420"/>
@@ -4105,6 +3617,9 @@
     </w:p>
     <w:p>
       <w:r>
+        <w:rPr>
+          <w:noProof/>
+        </w:rPr>
         <w:drawing>
           <wp:inline distT="0" distB="0" distL="0" distR="0" wp14:anchorId="69DD0658" wp14:editId="32532CAC">
             <wp:extent cx="5943600" cy="2970530"/>
@@ -4142,7 +3657,6 @@
         </w:drawing>
       </w:r>
     </w:p>
-    <w:p/>
     <w:p/>
     <w:p/>
     <w:sectPr>

</xml_diff>